<commit_message>
Add Use Case Diagram for actor and ERD
</commit_message>
<xml_diff>
--- a/Group5_SWP391_SE1947-GA/Group5_SRS-Document.docx
+++ b/Group5_SWP391_SE1947-GA/Group5_SRS-Document.docx
@@ -29,7 +29,7 @@
           <wp:inline distB="0" distT="0" distL="0" distR="0">
             <wp:extent cx="2713741" cy="742362"/>
             <wp:effectExtent b="0" l="0" r="0" t="0"/>
-            <wp:docPr id="50" name="image1.png"/>
+            <wp:docPr id="56" name="image1.png"/>
             <a:graphic>
               <a:graphicData uri="http://schemas.openxmlformats.org/drawingml/2006/picture">
                 <pic:pic>
@@ -395,7 +395,7 @@
     </w:p>
     <w:sdt>
       <w:sdtPr>
-        <w:id w:val="-854428032"/>
+        <w:id w:val="-1747972131"/>
         <w:docPartObj>
           <w:docPartGallery w:val="Table of Contents"/>
           <w:docPartUnique w:val="1"/>
@@ -3728,12 +3728,12 @@
           <wp:inline distB="114300" distT="114300" distL="114300" distR="114300">
             <wp:extent cx="5746440" cy="3632200"/>
             <wp:effectExtent b="0" l="0" r="0" t="0"/>
-            <wp:docPr id="52" name="image2.png"/>
+            <wp:docPr id="54" name="image3.png"/>
             <a:graphic>
               <a:graphicData uri="http://schemas.openxmlformats.org/drawingml/2006/picture">
                 <pic:pic>
                   <pic:nvPicPr>
-                    <pic:cNvPr id="0" name="image2.png"/>
+                    <pic:cNvPr id="0" name="image3.png"/>
                     <pic:cNvPicPr preferRelativeResize="0"/>
                   </pic:nvPicPr>
                   <pic:blipFill>
@@ -10510,6 +10510,8 @@
         <w:pStyle w:val="Heading4"/>
         <w:rPr>
           <w:rFonts w:ascii="Times New Roman" w:cs="Times New Roman" w:eastAsia="Times New Roman" w:hAnsi="Times New Roman"/>
+          <w:i w:val="1"/>
+          <w:color w:val="0000ff"/>
         </w:rPr>
       </w:pPr>
       <w:r>
@@ -10519,24 +10521,10 @@
         </w:rPr>
         <w:t xml:space="preserve">1.3.2 Use Case Diagrams</w:t>
       </w:r>
-    </w:p>
-    <w:p>
-      <w:pPr>
-        <w:jc w:val="both"/>
-        <w:rPr>
-          <w:rFonts w:ascii="Times New Roman" w:cs="Times New Roman" w:eastAsia="Times New Roman" w:hAnsi="Times New Roman"/>
-          <w:i w:val="1"/>
-          <w:color w:val="0000ff"/>
-        </w:rPr>
-      </w:pPr>
       <w:r>
         <w:rPr>
-          <w:rFonts w:ascii="Times New Roman" w:cs="Times New Roman" w:eastAsia="Times New Roman" w:hAnsi="Times New Roman"/>
-          <w:i w:val="1"/>
-          <w:color w:val="0000ff"/>
           <w:rtl w:val="0"/>
         </w:rPr>
-        <w:t xml:space="preserve">In this section, you need to provide the UC diagram(s) to show the actor-UCs and UC-UC relationships like the sample below. You can have multiple UC diagrams for the system, each diagram is for one actor or one workflow]</w:t>
       </w:r>
     </w:p>
     <w:p>
@@ -10576,6 +10564,43 @@
       </w:pPr>
       <w:r>
         <w:rPr>
+          <w:rFonts w:ascii="Times New Roman" w:cs="Times New Roman" w:eastAsia="Times New Roman" w:hAnsi="Times New Roman"/>
+        </w:rPr>
+        <w:drawing>
+          <wp:inline distB="114300" distT="114300" distL="114300" distR="114300">
+            <wp:extent cx="5329238" cy="6084800"/>
+            <wp:effectExtent b="0" l="0" r="0" t="0"/>
+            <wp:docPr id="55" name="image6.png"/>
+            <a:graphic>
+              <a:graphicData uri="http://schemas.openxmlformats.org/drawingml/2006/picture">
+                <pic:pic>
+                  <pic:nvPicPr>
+                    <pic:cNvPr id="0" name="image6.png"/>
+                    <pic:cNvPicPr preferRelativeResize="0"/>
+                  </pic:nvPicPr>
+                  <pic:blipFill>
+                    <a:blip r:embed="rId9"/>
+                    <a:srcRect b="0" l="0" r="0" t="0"/>
+                    <a:stretch>
+                      <a:fillRect/>
+                    </a:stretch>
+                  </pic:blipFill>
+                  <pic:spPr>
+                    <a:xfrm>
+                      <a:off x="0" y="0"/>
+                      <a:ext cx="5329238" cy="6084800"/>
+                    </a:xfrm>
+                    <a:prstGeom prst="rect"/>
+                    <a:ln/>
+                  </pic:spPr>
+                </pic:pic>
+              </a:graphicData>
+            </a:graphic>
+          </wp:inline>
+        </w:drawing>
+      </w:r>
+      <w:r>
+        <w:rPr>
           <w:rtl w:val="0"/>
         </w:rPr>
       </w:r>
@@ -10592,7 +10617,52 @@
           <w:rFonts w:ascii="Times New Roman" w:cs="Times New Roman" w:eastAsia="Times New Roman" w:hAnsi="Times New Roman"/>
           <w:rtl w:val="0"/>
         </w:rPr>
-        <w:t xml:space="preserve">1.3.2.2 UCs for Student</w:t>
+        <w:t xml:space="preserve">1.3.2.2 UCs for Customer</w:t>
+      </w:r>
+    </w:p>
+    <w:p>
+      <w:pPr>
+        <w:rPr/>
+      </w:pPr>
+      <w:r>
+        <w:rPr/>
+        <w:drawing>
+          <wp:inline distB="114300" distT="114300" distL="114300" distR="114300">
+            <wp:extent cx="5995988" cy="5248275"/>
+            <wp:effectExtent b="0" l="0" r="0" t="0"/>
+            <wp:docPr id="59" name="image9.png"/>
+            <a:graphic>
+              <a:graphicData uri="http://schemas.openxmlformats.org/drawingml/2006/picture">
+                <pic:pic>
+                  <pic:nvPicPr>
+                    <pic:cNvPr id="0" name="image9.png"/>
+                    <pic:cNvPicPr preferRelativeResize="0"/>
+                  </pic:nvPicPr>
+                  <pic:blipFill>
+                    <a:blip r:embed="rId10"/>
+                    <a:srcRect b="0" l="0" r="0" t="0"/>
+                    <a:stretch>
+                      <a:fillRect/>
+                    </a:stretch>
+                  </pic:blipFill>
+                  <pic:spPr>
+                    <a:xfrm>
+                      <a:off x="0" y="0"/>
+                      <a:ext cx="5995988" cy="5248275"/>
+                    </a:xfrm>
+                    <a:prstGeom prst="rect"/>
+                    <a:ln/>
+                  </pic:spPr>
+                </pic:pic>
+              </a:graphicData>
+            </a:graphic>
+          </wp:inline>
+        </w:drawing>
+      </w:r>
+      <w:r>
+        <w:rPr>
+          <w:rtl w:val="0"/>
+        </w:rPr>
       </w:r>
     </w:p>
     <w:p>
@@ -10629,6 +10699,41 @@
         <w:rPr/>
       </w:pPr>
       <w:r>
+        <w:rPr/>
+        <w:drawing>
+          <wp:inline distB="114300" distT="114300" distL="114300" distR="114300">
+            <wp:extent cx="5095875" cy="6610350"/>
+            <wp:effectExtent b="0" l="0" r="0" t="0"/>
+            <wp:docPr id="50" name="image5.png"/>
+            <a:graphic>
+              <a:graphicData uri="http://schemas.openxmlformats.org/drawingml/2006/picture">
+                <pic:pic>
+                  <pic:nvPicPr>
+                    <pic:cNvPr id="0" name="image5.png"/>
+                    <pic:cNvPicPr preferRelativeResize="0"/>
+                  </pic:nvPicPr>
+                  <pic:blipFill>
+                    <a:blip r:embed="rId11"/>
+                    <a:srcRect b="0" l="0" r="0" t="0"/>
+                    <a:stretch>
+                      <a:fillRect/>
+                    </a:stretch>
+                  </pic:blipFill>
+                  <pic:spPr>
+                    <a:xfrm>
+                      <a:off x="0" y="0"/>
+                      <a:ext cx="5095875" cy="6610350"/>
+                    </a:xfrm>
+                    <a:prstGeom prst="rect"/>
+                    <a:ln/>
+                  </pic:spPr>
+                </pic:pic>
+              </a:graphicData>
+            </a:graphic>
+          </wp:inline>
+        </w:drawing>
+      </w:r>
+      <w:r>
         <w:rPr>
           <w:rtl w:val="0"/>
         </w:rPr>
@@ -10637,7 +10742,9 @@
     <w:p>
       <w:pPr>
         <w:pStyle w:val="Heading5"/>
-        <w:rPr/>
+        <w:rPr>
+          <w:rFonts w:ascii="Times New Roman" w:cs="Times New Roman" w:eastAsia="Times New Roman" w:hAnsi="Times New Roman"/>
+        </w:rPr>
       </w:pPr>
       <w:bookmarkStart w:colFirst="0" w:colLast="0" w:name="_heading=h.fa8wkgs3qe4q" w:id="6"/>
       <w:bookmarkEnd w:id="6"/>
@@ -10648,6 +10755,46 @@
         </w:rPr>
         <w:t xml:space="preserve">1.3.2.3 UCs for Admin</w:t>
       </w:r>
+    </w:p>
+    <w:p>
+      <w:pPr>
+        <w:rPr/>
+      </w:pPr>
+      <w:r>
+        <w:rPr/>
+        <w:drawing>
+          <wp:inline distB="114300" distT="114300" distL="114300" distR="114300">
+            <wp:extent cx="5746440" cy="6515100"/>
+            <wp:effectExtent b="0" l="0" r="0" t="0"/>
+            <wp:docPr id="52" name="image8.png"/>
+            <a:graphic>
+              <a:graphicData uri="http://schemas.openxmlformats.org/drawingml/2006/picture">
+                <pic:pic>
+                  <pic:nvPicPr>
+                    <pic:cNvPr id="0" name="image8.png"/>
+                    <pic:cNvPicPr preferRelativeResize="0"/>
+                  </pic:nvPicPr>
+                  <pic:blipFill>
+                    <a:blip r:embed="rId12"/>
+                    <a:srcRect b="0" l="0" r="0" t="0"/>
+                    <a:stretch>
+                      <a:fillRect/>
+                    </a:stretch>
+                  </pic:blipFill>
+                  <pic:spPr>
+                    <a:xfrm>
+                      <a:off x="0" y="0"/>
+                      <a:ext cx="5746440" cy="6515100"/>
+                    </a:xfrm>
+                    <a:prstGeom prst="rect"/>
+                    <a:ln/>
+                  </pic:spPr>
+                </pic:pic>
+              </a:graphicData>
+            </a:graphic>
+          </wp:inline>
+        </w:drawing>
+      </w:r>
       <w:r>
         <w:rPr>
           <w:rtl w:val="0"/>
@@ -10656,8 +10803,18 @@
     </w:p>
     <w:p>
       <w:pPr>
+        <w:pStyle w:val="Heading5"/>
         <w:rPr/>
       </w:pPr>
+      <w:bookmarkStart w:colFirst="0" w:colLast="0" w:name="_heading=h.sf1klt3o4fpw" w:id="7"/>
+      <w:bookmarkEnd w:id="7"/>
+      <w:r>
+        <w:rPr>
+          <w:rFonts w:ascii="Times New Roman" w:cs="Times New Roman" w:eastAsia="Times New Roman" w:hAnsi="Times New Roman"/>
+          <w:rtl w:val="0"/>
+        </w:rPr>
+        <w:t xml:space="preserve">1.3.2.3 UCs for System</w:t>
+      </w:r>
       <w:r>
         <w:rPr>
           <w:rtl w:val="0"/>
@@ -10666,9 +10823,7 @@
     </w:p>
     <w:p>
       <w:pPr>
-        <w:rPr>
-          <w:rFonts w:ascii="Times New Roman" w:cs="Times New Roman" w:eastAsia="Times New Roman" w:hAnsi="Times New Roman"/>
-        </w:rPr>
+        <w:rPr/>
       </w:pPr>
       <w:r>
         <w:rPr>
@@ -10678,13 +10833,110 @@
     </w:p>
     <w:p>
       <w:pPr>
+        <w:rPr>
+          <w:rFonts w:ascii="Times New Roman" w:cs="Times New Roman" w:eastAsia="Times New Roman" w:hAnsi="Times New Roman"/>
+        </w:rPr>
+      </w:pPr>
+      <w:r>
+        <w:rPr>
+          <w:rtl w:val="0"/>
+        </w:rPr>
+      </w:r>
+    </w:p>
+    <w:p>
+      <w:pPr>
+        <w:rPr>
+          <w:rFonts w:ascii="Times New Roman" w:cs="Times New Roman" w:eastAsia="Times New Roman" w:hAnsi="Times New Roman"/>
+        </w:rPr>
+      </w:pPr>
+      <w:r>
+        <w:rPr>
+          <w:rtl w:val="0"/>
+        </w:rPr>
+      </w:r>
+    </w:p>
+    <w:p>
+      <w:pPr>
+        <w:rPr>
+          <w:rFonts w:ascii="Times New Roman" w:cs="Times New Roman" w:eastAsia="Times New Roman" w:hAnsi="Times New Roman"/>
+        </w:rPr>
+      </w:pPr>
+      <w:r>
+        <w:rPr>
+          <w:rtl w:val="0"/>
+        </w:rPr>
+      </w:r>
+    </w:p>
+    <w:p>
+      <w:pPr>
+        <w:rPr>
+          <w:rFonts w:ascii="Times New Roman" w:cs="Times New Roman" w:eastAsia="Times New Roman" w:hAnsi="Times New Roman"/>
+        </w:rPr>
+      </w:pPr>
+      <w:r>
+        <w:rPr>
+          <w:rtl w:val="0"/>
+        </w:rPr>
+      </w:r>
+    </w:p>
+    <w:p>
+      <w:pPr>
+        <w:rPr>
+          <w:rFonts w:ascii="Times New Roman" w:cs="Times New Roman" w:eastAsia="Times New Roman" w:hAnsi="Times New Roman"/>
+        </w:rPr>
+      </w:pPr>
+      <w:r>
+        <w:rPr>
+          <w:rFonts w:ascii="Times New Roman" w:cs="Times New Roman" w:eastAsia="Times New Roman" w:hAnsi="Times New Roman"/>
+        </w:rPr>
+        <w:drawing>
+          <wp:inline distB="114300" distT="114300" distL="114300" distR="114300">
+            <wp:extent cx="5746440" cy="7010400"/>
+            <wp:effectExtent b="0" l="0" r="0" t="0"/>
+            <wp:docPr id="51" name="image11.png"/>
+            <a:graphic>
+              <a:graphicData uri="http://schemas.openxmlformats.org/drawingml/2006/picture">
+                <pic:pic>
+                  <pic:nvPicPr>
+                    <pic:cNvPr id="0" name="image11.png"/>
+                    <pic:cNvPicPr preferRelativeResize="0"/>
+                  </pic:nvPicPr>
+                  <pic:blipFill>
+                    <a:blip r:embed="rId13"/>
+                    <a:srcRect b="0" l="0" r="0" t="0"/>
+                    <a:stretch>
+                      <a:fillRect/>
+                    </a:stretch>
+                  </pic:blipFill>
+                  <pic:spPr>
+                    <a:xfrm>
+                      <a:off x="0" y="0"/>
+                      <a:ext cx="5746440" cy="7010400"/>
+                    </a:xfrm>
+                    <a:prstGeom prst="rect"/>
+                    <a:ln/>
+                  </pic:spPr>
+                </pic:pic>
+              </a:graphicData>
+            </a:graphic>
+          </wp:inline>
+        </w:drawing>
+      </w:r>
+      <w:r>
+        <w:rPr>
+          <w:rtl w:val="0"/>
+        </w:rPr>
+      </w:r>
+    </w:p>
+    <w:p>
+      <w:pPr>
         <w:pStyle w:val="Heading3"/>
         <w:rPr>
           <w:rFonts w:ascii="Times New Roman" w:cs="Times New Roman" w:eastAsia="Times New Roman" w:hAnsi="Times New Roman"/>
         </w:rPr>
       </w:pPr>
-      <w:bookmarkStart w:colFirst="0" w:colLast="0" w:name="_heading=h.g85g0f7uxsxi" w:id="7"/>
-      <w:bookmarkEnd w:id="7"/>
+      <w:bookmarkStart w:colFirst="0" w:colLast="0" w:name="_heading=h.g85g0f7uxsxi" w:id="8"/>
+      <w:bookmarkEnd w:id="8"/>
       <w:r>
         <w:rPr>
           <w:rFonts w:ascii="Times New Roman" w:cs="Times New Roman" w:eastAsia="Times New Roman" w:hAnsi="Times New Roman"/>
@@ -10793,8 +11045,8 @@
           <w:color w:val="0000ff"/>
         </w:rPr>
       </w:pPr>
-      <w:bookmarkStart w:colFirst="0" w:colLast="0" w:name="_heading=h.slz9qed1jp37" w:id="8"/>
-      <w:bookmarkEnd w:id="8"/>
+      <w:bookmarkStart w:colFirst="0" w:colLast="0" w:name="_heading=h.slz9qed1jp37" w:id="9"/>
+      <w:bookmarkEnd w:id="9"/>
       <w:r>
         <w:rPr>
           <w:rtl w:val="0"/>
@@ -10804,7 +11056,7 @@
     <w:sdt>
       <w:sdtPr>
         <w:lock w:val="contentLocked"/>
-        <w:id w:val="-738164020"/>
+        <w:id w:val="98934148"/>
         <w:tag w:val="goog_rdk_0"/>
       </w:sdtPr>
       <w:sdtContent>
@@ -14465,8 +14717,8 @@
           <w:rFonts w:ascii="Times New Roman" w:cs="Times New Roman" w:eastAsia="Times New Roman" w:hAnsi="Times New Roman"/>
         </w:rPr>
       </w:pPr>
-      <w:bookmarkStart w:colFirst="0" w:colLast="0" w:name="_heading=h.2w2t5lrb1w7q" w:id="9"/>
-      <w:bookmarkEnd w:id="9"/>
+      <w:bookmarkStart w:colFirst="0" w:colLast="0" w:name="_heading=h.2w2t5lrb1w7q" w:id="10"/>
+      <w:bookmarkEnd w:id="10"/>
       <w:r>
         <w:rPr>
           <w:rtl w:val="0"/>
@@ -15353,80 +15605,50 @@
         <w:pStyle w:val="Heading3"/>
         <w:rPr>
           <w:rFonts w:ascii="Times New Roman" w:cs="Times New Roman" w:eastAsia="Times New Roman" w:hAnsi="Times New Roman"/>
-        </w:rPr>
-      </w:pPr>
-      <w:bookmarkStart w:colFirst="0" w:colLast="0" w:name="_heading=h.n90oqt5mwceg" w:id="10"/>
-      <w:bookmarkEnd w:id="10"/>
+          <w:i w:val="1"/>
+          <w:color w:val="0000ff"/>
+        </w:rPr>
+      </w:pPr>
+      <w:bookmarkStart w:colFirst="0" w:colLast="0" w:name="_heading=h.n90oqt5mwceg" w:id="11"/>
+      <w:bookmarkEnd w:id="11"/>
       <w:r>
         <w:rPr>
           <w:rFonts w:ascii="Times New Roman" w:cs="Times New Roman" w:eastAsia="Times New Roman" w:hAnsi="Times New Roman"/>
           <w:rtl w:val="0"/>
         </w:rPr>
         <w:t xml:space="preserve">1.5 Entity Relationship Diagram</w:t>
+      </w:r>
+      <w:r>
+        <w:rPr>
+          <w:rtl w:val="0"/>
+        </w:rPr>
       </w:r>
     </w:p>
     <w:p>
       <w:pPr>
-        <w:rPr>
-          <w:rFonts w:ascii="Times New Roman" w:cs="Times New Roman" w:eastAsia="Times New Roman" w:hAnsi="Times New Roman"/>
-          <w:i w:val="1"/>
-          <w:color w:val="0000ff"/>
+        <w:jc w:val="center"/>
+        <w:rPr>
+          <w:rFonts w:ascii="Times New Roman" w:cs="Times New Roman" w:eastAsia="Times New Roman" w:hAnsi="Times New Roman"/>
         </w:rPr>
       </w:pPr>
       <w:r>
         <w:rPr>
           <w:rFonts w:ascii="Times New Roman" w:cs="Times New Roman" w:eastAsia="Times New Roman" w:hAnsi="Times New Roman"/>
-          <w:i w:val="1"/>
-          <w:color w:val="0000ff"/>
-          <w:rtl w:val="0"/>
-        </w:rPr>
-        <w:t xml:space="preserve">[Provide the </w:t>
-      </w:r>
-      <w:r>
-        <w:rPr>
-          <w:rFonts w:ascii="Times New Roman" w:cs="Times New Roman" w:eastAsia="Times New Roman" w:hAnsi="Times New Roman"/>
-          <w:b w:val="1"/>
-          <w:i w:val="1"/>
-          <w:color w:val="0000ff"/>
-          <w:rtl w:val="0"/>
-        </w:rPr>
-        <w:t xml:space="preserve">ERD</w:t>
-      </w:r>
-      <w:r>
-        <w:rPr>
-          <w:rFonts w:ascii="Times New Roman" w:cs="Times New Roman" w:eastAsia="Times New Roman" w:hAnsi="Times New Roman"/>
-          <w:i w:val="1"/>
-          <w:color w:val="0000ff"/>
-          <w:rtl w:val="0"/>
-        </w:rPr>
-        <w:t xml:space="preserve"> using the Crow-Foot notation and the entity descriptions as below]</w:t>
-      </w:r>
-    </w:p>
-    <w:p>
-      <w:pPr>
-        <w:jc w:val="center"/>
-        <w:rPr>
-          <w:rFonts w:ascii="Times New Roman" w:cs="Times New Roman" w:eastAsia="Times New Roman" w:hAnsi="Times New Roman"/>
-        </w:rPr>
-      </w:pPr>
-      <w:r>
-        <w:rPr>
-          <w:rFonts w:ascii="Times New Roman" w:cs="Times New Roman" w:eastAsia="Times New Roman" w:hAnsi="Times New Roman"/>
         </w:rPr>
         <w:drawing>
-          <wp:inline distB="0" distT="0" distL="0" distR="0">
-            <wp:extent cx="5366353" cy="2381857"/>
+          <wp:inline distB="114300" distT="114300" distL="114300" distR="114300">
+            <wp:extent cx="5746440" cy="6629400"/>
             <wp:effectExtent b="0" l="0" r="0" t="0"/>
-            <wp:docPr id="51" name="image3.png"/>
+            <wp:docPr id="53" name="image7.png"/>
             <a:graphic>
               <a:graphicData uri="http://schemas.openxmlformats.org/drawingml/2006/picture">
                 <pic:pic>
                   <pic:nvPicPr>
-                    <pic:cNvPr id="0" name="image3.png"/>
+                    <pic:cNvPr id="0" name="image7.png"/>
                     <pic:cNvPicPr preferRelativeResize="0"/>
                   </pic:nvPicPr>
                   <pic:blipFill>
-                    <a:blip r:embed="rId9"/>
+                    <a:blip r:embed="rId14"/>
                     <a:srcRect b="0" l="0" r="0" t="0"/>
                     <a:stretch>
                       <a:fillRect/>
@@ -15435,7 +15657,7 @@
                   <pic:spPr>
                     <a:xfrm>
                       <a:off x="0" y="0"/>
-                      <a:ext cx="5366353" cy="2381857"/>
+                      <a:ext cx="5746440" cy="6629400"/>
                     </a:xfrm>
                     <a:prstGeom prst="rect"/>
                     <a:ln/>
@@ -15615,7 +15837,7 @@
                 <w:szCs w:val="22"/>
                 <w:rtl w:val="0"/>
               </w:rPr>
-              <w:t xml:space="preserve">Patrol</w:t>
+              <w:t xml:space="preserve">Users</w:t>
             </w:r>
           </w:p>
         </w:tc>
@@ -15634,7 +15856,7 @@
                 <w:szCs w:val="22"/>
                 <w:rtl w:val="0"/>
               </w:rPr>
-              <w:t xml:space="preserve">Cafeteria’s customer information</w:t>
+              <w:t xml:space="preserve">Stores information of all users in the system (customers, staff, admins) including personal details, login credentials, and roles.</w:t>
             </w:r>
           </w:p>
         </w:tc>
@@ -15678,7 +15900,7 @@
                 <w:szCs w:val="22"/>
                 <w:rtl w:val="0"/>
               </w:rPr>
-              <w:t xml:space="preserve">Meal</w:t>
+              <w:t xml:space="preserve">Movies</w:t>
             </w:r>
           </w:p>
         </w:tc>
@@ -15697,7 +15919,7 @@
                 <w:szCs w:val="22"/>
                 <w:rtl w:val="0"/>
               </w:rPr>
-              <w:t xml:space="preserve">…</w:t>
+              <w:t xml:space="preserve">Contains movie details such as title, genre, duration, description, poster, trailer, release date, and status.</w:t>
             </w:r>
           </w:p>
         </w:tc>
@@ -15741,7 +15963,7 @@
                 <w:szCs w:val="22"/>
                 <w:rtl w:val="0"/>
               </w:rPr>
-              <w:t xml:space="preserve">…</w:t>
+              <w:t xml:space="preserve">Ratings</w:t>
             </w:r>
           </w:p>
         </w:tc>
@@ -15756,8 +15978,515 @@
             </w:pPr>
             <w:r>
               <w:rPr>
-                <w:rtl w:val="0"/>
-              </w:rPr>
+                <w:sz w:val="22"/>
+                <w:szCs w:val="22"/>
+                <w:rtl w:val="0"/>
+              </w:rPr>
+              <w:t xml:space="preserve">Stores customer ratings and reviews for movies.</w:t>
+            </w:r>
+          </w:p>
+        </w:tc>
+      </w:tr>
+      <w:tr>
+        <w:trPr>
+          <w:cantSplit w:val="0"/>
+          <w:tblHeader w:val="0"/>
+        </w:trPr>
+        <w:tc>
+          <w:tcPr/>
+          <w:p>
+            <w:pPr>
+              <w:rPr>
+                <w:sz w:val="22"/>
+                <w:szCs w:val="22"/>
+              </w:rPr>
+            </w:pPr>
+            <w:r>
+              <w:rPr>
+                <w:sz w:val="22"/>
+                <w:szCs w:val="22"/>
+                <w:rtl w:val="0"/>
+              </w:rPr>
+              <w:t xml:space="preserve">4</w:t>
+            </w:r>
+          </w:p>
+        </w:tc>
+        <w:tc>
+          <w:tcPr/>
+          <w:p>
+            <w:pPr>
+              <w:rPr>
+                <w:sz w:val="22"/>
+                <w:szCs w:val="22"/>
+              </w:rPr>
+            </w:pPr>
+            <w:r>
+              <w:rPr>
+                <w:sz w:val="22"/>
+                <w:szCs w:val="22"/>
+                <w:rtl w:val="0"/>
+              </w:rPr>
+              <w:t xml:space="preserve">Favorites</w:t>
+            </w:r>
+          </w:p>
+        </w:tc>
+        <w:tc>
+          <w:tcPr/>
+          <w:p>
+            <w:pPr>
+              <w:rPr>
+                <w:sz w:val="22"/>
+                <w:szCs w:val="22"/>
+              </w:rPr>
+            </w:pPr>
+            <w:r>
+              <w:rPr>
+                <w:sz w:val="22"/>
+                <w:szCs w:val="22"/>
+                <w:rtl w:val="0"/>
+              </w:rPr>
+              <w:t xml:space="preserve">Keeps track of movies favorited by customers.</w:t>
+            </w:r>
+          </w:p>
+        </w:tc>
+      </w:tr>
+      <w:tr>
+        <w:trPr>
+          <w:cantSplit w:val="0"/>
+          <w:tblHeader w:val="0"/>
+        </w:trPr>
+        <w:tc>
+          <w:tcPr/>
+          <w:p>
+            <w:pPr>
+              <w:rPr>
+                <w:sz w:val="22"/>
+                <w:szCs w:val="22"/>
+              </w:rPr>
+            </w:pPr>
+            <w:r>
+              <w:rPr>
+                <w:sz w:val="22"/>
+                <w:szCs w:val="22"/>
+                <w:rtl w:val="0"/>
+              </w:rPr>
+              <w:t xml:space="preserve">5</w:t>
+            </w:r>
+          </w:p>
+        </w:tc>
+        <w:tc>
+          <w:tcPr/>
+          <w:p>
+            <w:pPr>
+              <w:rPr>
+                <w:sz w:val="22"/>
+                <w:szCs w:val="22"/>
+              </w:rPr>
+            </w:pPr>
+            <w:r>
+              <w:rPr>
+                <w:sz w:val="22"/>
+                <w:szCs w:val="22"/>
+                <w:rtl w:val="0"/>
+              </w:rPr>
+              <w:t xml:space="preserve">Theaters</w:t>
+            </w:r>
+          </w:p>
+        </w:tc>
+        <w:tc>
+          <w:tcPr/>
+          <w:p>
+            <w:pPr>
+              <w:rPr>
+                <w:sz w:val="22"/>
+                <w:szCs w:val="22"/>
+              </w:rPr>
+            </w:pPr>
+            <w:r>
+              <w:rPr>
+                <w:sz w:val="22"/>
+                <w:szCs w:val="22"/>
+                <w:rtl w:val="0"/>
+              </w:rPr>
+              <w:t xml:space="preserve">Stores information about cinema theaters including name, address, contact info, and status.</w:t>
+            </w:r>
+          </w:p>
+        </w:tc>
+      </w:tr>
+      <w:tr>
+        <w:trPr>
+          <w:cantSplit w:val="0"/>
+          <w:tblHeader w:val="0"/>
+        </w:trPr>
+        <w:tc>
+          <w:tcPr/>
+          <w:p>
+            <w:pPr>
+              <w:rPr>
+                <w:sz w:val="22"/>
+                <w:szCs w:val="22"/>
+              </w:rPr>
+            </w:pPr>
+            <w:r>
+              <w:rPr>
+                <w:sz w:val="22"/>
+                <w:szCs w:val="22"/>
+                <w:rtl w:val="0"/>
+              </w:rPr>
+              <w:t xml:space="preserve">6</w:t>
+            </w:r>
+          </w:p>
+        </w:tc>
+        <w:tc>
+          <w:tcPr/>
+          <w:p>
+            <w:pPr>
+              <w:rPr>
+                <w:sz w:val="22"/>
+                <w:szCs w:val="22"/>
+              </w:rPr>
+            </w:pPr>
+            <w:r>
+              <w:rPr>
+                <w:sz w:val="22"/>
+                <w:szCs w:val="22"/>
+                <w:rtl w:val="0"/>
+              </w:rPr>
+              <w:t xml:space="preserve">Screens</w:t>
+            </w:r>
+          </w:p>
+        </w:tc>
+        <w:tc>
+          <w:tcPr/>
+          <w:p>
+            <w:pPr>
+              <w:rPr>
+                <w:sz w:val="22"/>
+                <w:szCs w:val="22"/>
+              </w:rPr>
+            </w:pPr>
+            <w:r>
+              <w:rPr>
+                <w:sz w:val="22"/>
+                <w:szCs w:val="22"/>
+                <w:rtl w:val="0"/>
+              </w:rPr>
+              <w:t xml:space="preserve">Represents theater rooms (screens) with seat layouts and capacity.</w:t>
+            </w:r>
+          </w:p>
+        </w:tc>
+      </w:tr>
+      <w:tr>
+        <w:trPr>
+          <w:cantSplit w:val="0"/>
+          <w:tblHeader w:val="0"/>
+        </w:trPr>
+        <w:tc>
+          <w:tcPr/>
+          <w:p>
+            <w:pPr>
+              <w:rPr>
+                <w:sz w:val="22"/>
+                <w:szCs w:val="22"/>
+              </w:rPr>
+            </w:pPr>
+            <w:r>
+              <w:rPr>
+                <w:sz w:val="22"/>
+                <w:szCs w:val="22"/>
+                <w:rtl w:val="0"/>
+              </w:rPr>
+              <w:t xml:space="preserve">7</w:t>
+            </w:r>
+          </w:p>
+        </w:tc>
+        <w:tc>
+          <w:tcPr/>
+          <w:p>
+            <w:pPr>
+              <w:rPr>
+                <w:sz w:val="22"/>
+                <w:szCs w:val="22"/>
+              </w:rPr>
+            </w:pPr>
+            <w:r>
+              <w:rPr>
+                <w:sz w:val="22"/>
+                <w:szCs w:val="22"/>
+                <w:rtl w:val="0"/>
+              </w:rPr>
+              <w:t xml:space="preserve">Showtimes</w:t>
+            </w:r>
+          </w:p>
+        </w:tc>
+        <w:tc>
+          <w:tcPr/>
+          <w:p>
+            <w:pPr>
+              <w:rPr>
+                <w:sz w:val="22"/>
+                <w:szCs w:val="22"/>
+              </w:rPr>
+            </w:pPr>
+            <w:r>
+              <w:rPr>
+                <w:sz w:val="22"/>
+                <w:szCs w:val="22"/>
+                <w:rtl w:val="0"/>
+              </w:rPr>
+              <w:t xml:space="preserve">Holds information about scheduled showtimes for movies in specific theaters and screens with ticket pricing.</w:t>
+            </w:r>
+          </w:p>
+        </w:tc>
+      </w:tr>
+      <w:tr>
+        <w:trPr>
+          <w:cantSplit w:val="0"/>
+          <w:tblHeader w:val="0"/>
+        </w:trPr>
+        <w:tc>
+          <w:tcPr/>
+          <w:p>
+            <w:pPr>
+              <w:rPr>
+                <w:sz w:val="22"/>
+                <w:szCs w:val="22"/>
+              </w:rPr>
+            </w:pPr>
+            <w:r>
+              <w:rPr>
+                <w:sz w:val="22"/>
+                <w:szCs w:val="22"/>
+                <w:rtl w:val="0"/>
+              </w:rPr>
+              <w:t xml:space="preserve">8</w:t>
+            </w:r>
+          </w:p>
+        </w:tc>
+        <w:tc>
+          <w:tcPr/>
+          <w:p>
+            <w:pPr>
+              <w:rPr>
+                <w:sz w:val="22"/>
+                <w:szCs w:val="22"/>
+              </w:rPr>
+            </w:pPr>
+            <w:r>
+              <w:rPr>
+                <w:sz w:val="22"/>
+                <w:szCs w:val="22"/>
+                <w:rtl w:val="0"/>
+              </w:rPr>
+              <w:t xml:space="preserve">Bookings</w:t>
+            </w:r>
+          </w:p>
+        </w:tc>
+        <w:tc>
+          <w:tcPr/>
+          <w:p>
+            <w:pPr>
+              <w:rPr>
+                <w:sz w:val="22"/>
+                <w:szCs w:val="22"/>
+              </w:rPr>
+            </w:pPr>
+            <w:r>
+              <w:rPr>
+                <w:sz w:val="22"/>
+                <w:szCs w:val="22"/>
+                <w:rtl w:val="0"/>
+              </w:rPr>
+              <w:t xml:space="preserve">Records customer bookings including selected seats, total amount, status, and booking date.</w:t>
+            </w:r>
+          </w:p>
+        </w:tc>
+      </w:tr>
+      <w:tr>
+        <w:trPr>
+          <w:cantSplit w:val="0"/>
+          <w:tblHeader w:val="0"/>
+        </w:trPr>
+        <w:tc>
+          <w:tcPr/>
+          <w:p>
+            <w:pPr>
+              <w:rPr>
+                <w:sz w:val="22"/>
+                <w:szCs w:val="22"/>
+              </w:rPr>
+            </w:pPr>
+            <w:r>
+              <w:rPr>
+                <w:sz w:val="22"/>
+                <w:szCs w:val="22"/>
+                <w:rtl w:val="0"/>
+              </w:rPr>
+              <w:t xml:space="preserve">9</w:t>
+            </w:r>
+          </w:p>
+        </w:tc>
+        <w:tc>
+          <w:tcPr/>
+          <w:p>
+            <w:pPr>
+              <w:rPr>
+                <w:sz w:val="22"/>
+                <w:szCs w:val="22"/>
+              </w:rPr>
+            </w:pPr>
+            <w:r>
+              <w:rPr>
+                <w:sz w:val="22"/>
+                <w:szCs w:val="22"/>
+                <w:rtl w:val="0"/>
+              </w:rPr>
+              <w:t xml:space="preserve">Payments</w:t>
+            </w:r>
+          </w:p>
+        </w:tc>
+        <w:tc>
+          <w:tcPr/>
+          <w:p>
+            <w:pPr>
+              <w:rPr>
+                <w:sz w:val="22"/>
+                <w:szCs w:val="22"/>
+              </w:rPr>
+            </w:pPr>
+            <w:r>
+              <w:rPr>
+                <w:sz w:val="22"/>
+                <w:szCs w:val="22"/>
+                <w:rtl w:val="0"/>
+              </w:rPr>
+              <w:t xml:space="preserve">Stores payment transactions linked to bookings, including method, amount, and status.</w:t>
+            </w:r>
+          </w:p>
+        </w:tc>
+      </w:tr>
+      <w:tr>
+        <w:trPr>
+          <w:cantSplit w:val="0"/>
+          <w:tblHeader w:val="0"/>
+        </w:trPr>
+        <w:tc>
+          <w:tcPr/>
+          <w:p>
+            <w:pPr>
+              <w:rPr>
+                <w:sz w:val="22"/>
+                <w:szCs w:val="22"/>
+              </w:rPr>
+            </w:pPr>
+            <w:r>
+              <w:rPr>
+                <w:sz w:val="22"/>
+                <w:szCs w:val="22"/>
+                <w:rtl w:val="0"/>
+              </w:rPr>
+              <w:t xml:space="preserve">10</w:t>
+            </w:r>
+          </w:p>
+        </w:tc>
+        <w:tc>
+          <w:tcPr/>
+          <w:p>
+            <w:pPr>
+              <w:rPr>
+                <w:sz w:val="22"/>
+                <w:szCs w:val="22"/>
+              </w:rPr>
+            </w:pPr>
+            <w:r>
+              <w:rPr>
+                <w:sz w:val="22"/>
+                <w:szCs w:val="22"/>
+                <w:rtl w:val="0"/>
+              </w:rPr>
+              <w:t xml:space="preserve">Notifications</w:t>
+            </w:r>
+          </w:p>
+        </w:tc>
+        <w:tc>
+          <w:tcPr/>
+          <w:p>
+            <w:pPr>
+              <w:rPr>
+                <w:sz w:val="22"/>
+                <w:szCs w:val="22"/>
+              </w:rPr>
+            </w:pPr>
+            <w:r>
+              <w:rPr>
+                <w:sz w:val="22"/>
+                <w:szCs w:val="22"/>
+                <w:rtl w:val="0"/>
+              </w:rPr>
+              <w:t xml:space="preserve">Keeps system-generated notifications sent to users, including read/unread status.</w:t>
+            </w:r>
+          </w:p>
+        </w:tc>
+      </w:tr>
+      <w:tr>
+        <w:trPr>
+          <w:cantSplit w:val="0"/>
+          <w:tblHeader w:val="0"/>
+        </w:trPr>
+        <w:tc>
+          <w:tcPr/>
+          <w:p>
+            <w:pPr>
+              <w:rPr>
+                <w:sz w:val="22"/>
+                <w:szCs w:val="22"/>
+              </w:rPr>
+            </w:pPr>
+            <w:r>
+              <w:rPr>
+                <w:sz w:val="22"/>
+                <w:szCs w:val="22"/>
+                <w:rtl w:val="0"/>
+              </w:rPr>
+              <w:t xml:space="preserve">11</w:t>
+            </w:r>
+          </w:p>
+        </w:tc>
+        <w:tc>
+          <w:tcPr/>
+          <w:p>
+            <w:pPr>
+              <w:rPr>
+                <w:sz w:val="22"/>
+                <w:szCs w:val="22"/>
+              </w:rPr>
+            </w:pPr>
+            <w:r>
+              <w:rPr>
+                <w:sz w:val="22"/>
+                <w:szCs w:val="22"/>
+                <w:rtl w:val="0"/>
+              </w:rPr>
+              <w:t xml:space="preserve">Banners</w:t>
+            </w:r>
+          </w:p>
+        </w:tc>
+        <w:tc>
+          <w:tcPr/>
+          <w:p>
+            <w:pPr>
+              <w:rPr>
+                <w:sz w:val="22"/>
+                <w:szCs w:val="22"/>
+              </w:rPr>
+            </w:pPr>
+            <w:r>
+              <w:rPr>
+                <w:sz w:val="22"/>
+                <w:szCs w:val="22"/>
+                <w:rtl w:val="0"/>
+              </w:rPr>
+              <w:t xml:space="preserve">Stores homepage banners with images, links, display period, and status.</w:t>
             </w:r>
           </w:p>
         </w:tc>
@@ -15782,8 +16511,8 @@
           <w:rFonts w:ascii="Times New Roman" w:cs="Times New Roman" w:eastAsia="Times New Roman" w:hAnsi="Times New Roman"/>
         </w:rPr>
       </w:pPr>
-      <w:bookmarkStart w:colFirst="0" w:colLast="0" w:name="_heading=h.ijxsl7o2hns3" w:id="11"/>
-      <w:bookmarkEnd w:id="11"/>
+      <w:bookmarkStart w:colFirst="0" w:colLast="0" w:name="_heading=h.ijxsl7o2hns3" w:id="12"/>
+      <w:bookmarkEnd w:id="12"/>
       <w:r>
         <w:rPr>
           <w:rFonts w:ascii="Times New Roman" w:cs="Times New Roman" w:eastAsia="Times New Roman" w:hAnsi="Times New Roman"/>
@@ -15837,8 +16566,8 @@
           <w:rFonts w:ascii="Times New Roman" w:cs="Times New Roman" w:eastAsia="Times New Roman" w:hAnsi="Times New Roman"/>
         </w:rPr>
       </w:pPr>
-      <w:bookmarkStart w:colFirst="0" w:colLast="0" w:name="_heading=h.67brenivjvht" w:id="12"/>
-      <w:bookmarkEnd w:id="12"/>
+      <w:bookmarkStart w:colFirst="0" w:colLast="0" w:name="_heading=h.67brenivjvht" w:id="13"/>
+      <w:bookmarkEnd w:id="13"/>
       <w:r>
         <w:rPr>
           <w:rFonts w:ascii="Times New Roman" w:cs="Times New Roman" w:eastAsia="Times New Roman" w:hAnsi="Times New Roman"/>
@@ -17594,8 +18323,8 @@
           <w:rFonts w:ascii="Times New Roman" w:cs="Times New Roman" w:eastAsia="Times New Roman" w:hAnsi="Times New Roman"/>
         </w:rPr>
       </w:pPr>
-      <w:bookmarkStart w:colFirst="0" w:colLast="0" w:name="_heading=h.y1sceeporpfh" w:id="13"/>
-      <w:bookmarkEnd w:id="13"/>
+      <w:bookmarkStart w:colFirst="0" w:colLast="0" w:name="_heading=h.y1sceeporpfh" w:id="14"/>
+      <w:bookmarkEnd w:id="14"/>
       <w:r>
         <w:rPr>
           <w:rFonts w:ascii="Times New Roman" w:cs="Times New Roman" w:eastAsia="Times New Roman" w:hAnsi="Times New Roman"/>
@@ -17643,8 +18372,8 @@
           <w:rFonts w:ascii="Times New Roman" w:cs="Times New Roman" w:eastAsia="Times New Roman" w:hAnsi="Times New Roman"/>
         </w:rPr>
       </w:pPr>
-      <w:bookmarkStart w:colFirst="0" w:colLast="0" w:name="_heading=h.d1tr4w5clo92" w:id="14"/>
-      <w:bookmarkEnd w:id="14"/>
+      <w:bookmarkStart w:colFirst="0" w:colLast="0" w:name="_heading=h.d1tr4w5clo92" w:id="15"/>
+      <w:bookmarkEnd w:id="15"/>
       <w:r>
         <w:rPr>
           <w:rFonts w:ascii="Times New Roman" w:cs="Times New Roman" w:eastAsia="Times New Roman" w:hAnsi="Times New Roman"/>
@@ -17661,8 +18390,8 @@
           <w:color w:val="0000ff"/>
         </w:rPr>
       </w:pPr>
-      <w:bookmarkStart w:colFirst="0" w:colLast="0" w:name="_heading=h.wl70gpd0856r" w:id="15"/>
-      <w:bookmarkEnd w:id="15"/>
+      <w:bookmarkStart w:colFirst="0" w:colLast="0" w:name="_heading=h.wl70gpd0856r" w:id="16"/>
+      <w:bookmarkEnd w:id="16"/>
       <w:r>
         <w:rPr>
           <w:rFonts w:ascii="Times New Roman" w:cs="Times New Roman" w:eastAsia="Times New Roman" w:hAnsi="Times New Roman"/>
@@ -17680,8 +18409,8 @@
           <w:rFonts w:ascii="Times New Roman" w:cs="Times New Roman" w:eastAsia="Times New Roman" w:hAnsi="Times New Roman"/>
         </w:rPr>
       </w:pPr>
-      <w:bookmarkStart w:colFirst="0" w:colLast="0" w:name="_heading=h.4guggyk0wi1r" w:id="16"/>
-      <w:bookmarkEnd w:id="16"/>
+      <w:bookmarkStart w:colFirst="0" w:colLast="0" w:name="_heading=h.4guggyk0wi1r" w:id="17"/>
+      <w:bookmarkEnd w:id="17"/>
       <w:r>
         <w:rPr>
           <w:rFonts w:ascii="Times New Roman" w:cs="Times New Roman" w:eastAsia="Times New Roman" w:hAnsi="Times New Roman"/>
@@ -17697,8 +18426,8 @@
           <w:rFonts w:ascii="Times New Roman" w:cs="Times New Roman" w:eastAsia="Times New Roman" w:hAnsi="Times New Roman"/>
         </w:rPr>
       </w:pPr>
-      <w:bookmarkStart w:colFirst="0" w:colLast="0" w:name="_heading=h.n8zj21t9e1c7" w:id="17"/>
-      <w:bookmarkEnd w:id="17"/>
+      <w:bookmarkStart w:colFirst="0" w:colLast="0" w:name="_heading=h.n8zj21t9e1c7" w:id="18"/>
+      <w:bookmarkEnd w:id="18"/>
       <w:r>
         <w:rPr>
           <w:rFonts w:ascii="Times New Roman" w:cs="Times New Roman" w:eastAsia="Times New Roman" w:hAnsi="Times New Roman"/>
@@ -18180,8 +18909,8 @@
           <w:rFonts w:ascii="Times New Roman" w:cs="Times New Roman" w:eastAsia="Times New Roman" w:hAnsi="Times New Roman"/>
         </w:rPr>
       </w:pPr>
-      <w:bookmarkStart w:colFirst="0" w:colLast="0" w:name="_heading=h.5wplhwij9haa" w:id="18"/>
-      <w:bookmarkEnd w:id="18"/>
+      <w:bookmarkStart w:colFirst="0" w:colLast="0" w:name="_heading=h.5wplhwij9haa" w:id="19"/>
+      <w:bookmarkEnd w:id="19"/>
       <w:r>
         <w:rPr>
           <w:rFonts w:ascii="Times New Roman" w:cs="Times New Roman" w:eastAsia="Times New Roman" w:hAnsi="Times New Roman"/>
@@ -18211,8 +18940,8 @@
           <w:rFonts w:ascii="Times New Roman" w:cs="Times New Roman" w:eastAsia="Times New Roman" w:hAnsi="Times New Roman"/>
         </w:rPr>
       </w:pPr>
-      <w:bookmarkStart w:colFirst="0" w:colLast="0" w:name="_heading=h.x3hknuuz8h6" w:id="19"/>
-      <w:bookmarkEnd w:id="19"/>
+      <w:bookmarkStart w:colFirst="0" w:colLast="0" w:name="_heading=h.x3hknuuz8h6" w:id="20"/>
+      <w:bookmarkEnd w:id="20"/>
       <w:r>
         <w:rPr>
           <w:rFonts w:ascii="Times New Roman" w:cs="Times New Roman" w:eastAsia="Times New Roman" w:hAnsi="Times New Roman"/>
@@ -18228,8 +18957,8 @@
           <w:rFonts w:ascii="Times New Roman" w:cs="Times New Roman" w:eastAsia="Times New Roman" w:hAnsi="Times New Roman"/>
         </w:rPr>
       </w:pPr>
-      <w:bookmarkStart w:colFirst="0" w:colLast="0" w:name="_heading=h.7gfx0j6m8i0j" w:id="20"/>
-      <w:bookmarkEnd w:id="20"/>
+      <w:bookmarkStart w:colFirst="0" w:colLast="0" w:name="_heading=h.7gfx0j6m8i0j" w:id="21"/>
+      <w:bookmarkEnd w:id="21"/>
       <w:r>
         <w:rPr>
           <w:rFonts w:ascii="Times New Roman" w:cs="Times New Roman" w:eastAsia="Times New Roman" w:hAnsi="Times New Roman"/>
@@ -18260,8 +18989,8 @@
           <w:rFonts w:ascii="Times New Roman" w:cs="Times New Roman" w:eastAsia="Times New Roman" w:hAnsi="Times New Roman"/>
         </w:rPr>
       </w:pPr>
-      <w:bookmarkStart w:colFirst="0" w:colLast="0" w:name="_heading=h.9vrp1fzkmpf" w:id="21"/>
-      <w:bookmarkEnd w:id="21"/>
+      <w:bookmarkStart w:colFirst="0" w:colLast="0" w:name="_heading=h.9vrp1fzkmpf" w:id="22"/>
+      <w:bookmarkEnd w:id="22"/>
       <w:r>
         <w:rPr>
           <w:rFonts w:ascii="Times New Roman" w:cs="Times New Roman" w:eastAsia="Times New Roman" w:hAnsi="Times New Roman"/>
@@ -18291,8 +19020,8 @@
           <w:rFonts w:ascii="Times New Roman" w:cs="Times New Roman" w:eastAsia="Times New Roman" w:hAnsi="Times New Roman"/>
         </w:rPr>
       </w:pPr>
-      <w:bookmarkStart w:colFirst="0" w:colLast="0" w:name="_heading=h.vl5rilfa462" w:id="22"/>
-      <w:bookmarkEnd w:id="22"/>
+      <w:bookmarkStart w:colFirst="0" w:colLast="0" w:name="_heading=h.vl5rilfa462" w:id="23"/>
+      <w:bookmarkEnd w:id="23"/>
       <w:r>
         <w:rPr>
           <w:rFonts w:ascii="Times New Roman" w:cs="Times New Roman" w:eastAsia="Times New Roman" w:hAnsi="Times New Roman"/>
@@ -18322,8 +19051,8 @@
           <w:rFonts w:ascii="Times New Roman" w:cs="Times New Roman" w:eastAsia="Times New Roman" w:hAnsi="Times New Roman"/>
         </w:rPr>
       </w:pPr>
-      <w:bookmarkStart w:colFirst="0" w:colLast="0" w:name="_heading=h.kgn8zw35z128" w:id="23"/>
-      <w:bookmarkEnd w:id="23"/>
+      <w:bookmarkStart w:colFirst="0" w:colLast="0" w:name="_heading=h.kgn8zw35z128" w:id="24"/>
+      <w:bookmarkEnd w:id="24"/>
       <w:r>
         <w:rPr>
           <w:rFonts w:ascii="Times New Roman" w:cs="Times New Roman" w:eastAsia="Times New Roman" w:hAnsi="Times New Roman"/>
@@ -18339,8 +19068,8 @@
           <w:rFonts w:ascii="Times New Roman" w:cs="Times New Roman" w:eastAsia="Times New Roman" w:hAnsi="Times New Roman"/>
         </w:rPr>
       </w:pPr>
-      <w:bookmarkStart w:colFirst="0" w:colLast="0" w:name="_heading=h.1fzyz3y57yav" w:id="24"/>
-      <w:bookmarkEnd w:id="24"/>
+      <w:bookmarkStart w:colFirst="0" w:colLast="0" w:name="_heading=h.1fzyz3y57yav" w:id="25"/>
+      <w:bookmarkEnd w:id="25"/>
       <w:r>
         <w:rPr>
           <w:rFonts w:ascii="Times New Roman" w:cs="Times New Roman" w:eastAsia="Times New Roman" w:hAnsi="Times New Roman"/>
@@ -18378,7 +19107,7 @@
           <wp:inline distB="0" distT="0" distL="0" distR="0">
             <wp:extent cx="5746750" cy="1701165"/>
             <wp:effectExtent b="12700" l="12700" r="12700" t="12700"/>
-            <wp:docPr id="54" name="image4.png"/>
+            <wp:docPr id="58" name="image4.png"/>
             <a:graphic>
               <a:graphicData uri="http://schemas.openxmlformats.org/drawingml/2006/picture">
                 <pic:pic>
@@ -18387,7 +19116,7 @@
                     <pic:cNvPicPr preferRelativeResize="0"/>
                   </pic:nvPicPr>
                   <pic:blipFill>
-                    <a:blip r:embed="rId10"/>
+                    <a:blip r:embed="rId15"/>
                     <a:srcRect b="0" l="0" r="0" t="0"/>
                     <a:stretch>
                       <a:fillRect/>
@@ -18498,16 +19227,16 @@
                 <wp:extent cx="356870" cy="238125"/>
                 <wp:effectExtent b="0" l="0" r="0" t="0"/>
                 <wp:wrapNone/>
-                <wp:docPr id="48" name="image7.png"/>
+                <wp:docPr id="48" name="image12.png"/>
                 <a:graphic>
                   <a:graphicData uri="http://schemas.openxmlformats.org/drawingml/2006/picture">
                     <pic:pic>
                       <pic:nvPicPr>
-                        <pic:cNvPr id="0" name="image7.png"/>
+                        <pic:cNvPr id="0" name="image12.png"/>
                         <pic:cNvPicPr preferRelativeResize="0"/>
                       </pic:nvPicPr>
                       <pic:blipFill>
-                        <a:blip r:embed="rId11"/>
+                        <a:blip r:embed="rId16"/>
                         <a:srcRect/>
                         <a:stretch>
                           <a:fillRect/>
@@ -18610,16 +19339,16 @@
                 <wp:extent cx="356870" cy="238125"/>
                 <wp:effectExtent b="0" l="0" r="0" t="0"/>
                 <wp:wrapNone/>
-                <wp:docPr id="47" name="image6.png"/>
+                <wp:docPr id="47" name="image10.png"/>
                 <a:graphic>
                   <a:graphicData uri="http://schemas.openxmlformats.org/drawingml/2006/picture">
                     <pic:pic>
                       <pic:nvPicPr>
-                        <pic:cNvPr id="0" name="image6.png"/>
+                        <pic:cNvPr id="0" name="image10.png"/>
                         <pic:cNvPicPr preferRelativeResize="0"/>
                       </pic:nvPicPr>
                       <pic:blipFill>
-                        <a:blip r:embed="rId11"/>
+                        <a:blip r:embed="rId16"/>
                         <a:srcRect/>
                         <a:stretch>
                           <a:fillRect/>
@@ -18722,16 +19451,16 @@
                 <wp:extent cx="356870" cy="238125"/>
                 <wp:effectExtent b="0" l="0" r="0" t="0"/>
                 <wp:wrapNone/>
-                <wp:docPr id="49" name="image8.png"/>
+                <wp:docPr id="49" name="image13.png"/>
                 <a:graphic>
                   <a:graphicData uri="http://schemas.openxmlformats.org/drawingml/2006/picture">
                     <pic:pic>
                       <pic:nvPicPr>
-                        <pic:cNvPr id="0" name="image8.png"/>
+                        <pic:cNvPr id="0" name="image13.png"/>
                         <pic:cNvPicPr preferRelativeResize="0"/>
                       </pic:nvPicPr>
                       <pic:blipFill>
-                        <a:blip r:embed="rId11"/>
+                        <a:blip r:embed="rId16"/>
                         <a:srcRect/>
                         <a:stretch>
                           <a:fillRect/>
@@ -19275,16 +20004,16 @@
           <wp:inline distB="0" distT="0" distL="0" distR="0">
             <wp:extent cx="3297335" cy="2101186"/>
             <wp:effectExtent b="12700" l="12700" r="12700" t="12700"/>
-            <wp:docPr id="53" name="image5.png"/>
+            <wp:docPr id="57" name="image2.png"/>
             <a:graphic>
               <a:graphicData uri="http://schemas.openxmlformats.org/drawingml/2006/picture">
                 <pic:pic>
                   <pic:nvPicPr>
-                    <pic:cNvPr id="0" name="image5.png"/>
+                    <pic:cNvPr id="0" name="image2.png"/>
                     <pic:cNvPicPr preferRelativeResize="0"/>
                   </pic:nvPicPr>
                   <pic:blipFill>
-                    <a:blip r:embed="rId12"/>
+                    <a:blip r:embed="rId17"/>
                     <a:srcRect b="0" l="0" r="0" t="0"/>
                     <a:stretch>
                       <a:fillRect/>
@@ -19744,8 +20473,8 @@
           <w:rFonts w:ascii="Times New Roman" w:cs="Times New Roman" w:eastAsia="Times New Roman" w:hAnsi="Times New Roman"/>
         </w:rPr>
       </w:pPr>
-      <w:bookmarkStart w:colFirst="0" w:colLast="0" w:name="_heading=h.a0b820ekdt2c" w:id="25"/>
-      <w:bookmarkEnd w:id="25"/>
+      <w:bookmarkStart w:colFirst="0" w:colLast="0" w:name="_heading=h.a0b820ekdt2c" w:id="26"/>
+      <w:bookmarkEnd w:id="26"/>
       <w:r>
         <w:rPr>
           <w:rFonts w:ascii="Times New Roman" w:cs="Times New Roman" w:eastAsia="Times New Roman" w:hAnsi="Times New Roman"/>
@@ -19819,8 +20548,8 @@
           <w:rFonts w:ascii="Times New Roman" w:cs="Times New Roman" w:eastAsia="Times New Roman" w:hAnsi="Times New Roman"/>
         </w:rPr>
       </w:pPr>
-      <w:bookmarkStart w:colFirst="0" w:colLast="0" w:name="_heading=h.zihxw9dfneg2" w:id="26"/>
-      <w:bookmarkEnd w:id="26"/>
+      <w:bookmarkStart w:colFirst="0" w:colLast="0" w:name="_heading=h.zihxw9dfneg2" w:id="27"/>
+      <w:bookmarkEnd w:id="27"/>
       <w:r>
         <w:rPr>
           <w:rFonts w:ascii="Times New Roman" w:cs="Times New Roman" w:eastAsia="Times New Roman" w:hAnsi="Times New Roman"/>
@@ -19836,8 +20565,8 @@
           <w:rFonts w:ascii="Times New Roman" w:cs="Times New Roman" w:eastAsia="Times New Roman" w:hAnsi="Times New Roman"/>
         </w:rPr>
       </w:pPr>
-      <w:bookmarkStart w:colFirst="0" w:colLast="0" w:name="_heading=h.qeh6taqfgrkp" w:id="27"/>
-      <w:bookmarkEnd w:id="27"/>
+      <w:bookmarkStart w:colFirst="0" w:colLast="0" w:name="_heading=h.qeh6taqfgrkp" w:id="28"/>
+      <w:bookmarkEnd w:id="28"/>
       <w:r>
         <w:rPr>
           <w:rFonts w:ascii="Times New Roman" w:cs="Times New Roman" w:eastAsia="Times New Roman" w:hAnsi="Times New Roman"/>
@@ -19871,8 +20600,8 @@
           <w:rFonts w:ascii="Times New Roman" w:cs="Times New Roman" w:eastAsia="Times New Roman" w:hAnsi="Times New Roman"/>
         </w:rPr>
       </w:pPr>
-      <w:bookmarkStart w:colFirst="0" w:colLast="0" w:name="_heading=h.46t49gsj0jzg" w:id="28"/>
-      <w:bookmarkEnd w:id="28"/>
+      <w:bookmarkStart w:colFirst="0" w:colLast="0" w:name="_heading=h.46t49gsj0jzg" w:id="29"/>
+      <w:bookmarkEnd w:id="29"/>
       <w:r>
         <w:rPr>
           <w:rFonts w:ascii="Times New Roman" w:cs="Times New Roman" w:eastAsia="Times New Roman" w:hAnsi="Times New Roman"/>
@@ -19906,8 +20635,8 @@
           <w:rFonts w:ascii="Times New Roman" w:cs="Times New Roman" w:eastAsia="Times New Roman" w:hAnsi="Times New Roman"/>
         </w:rPr>
       </w:pPr>
-      <w:bookmarkStart w:colFirst="0" w:colLast="0" w:name="_heading=h.1y810tw" w:id="29"/>
-      <w:bookmarkEnd w:id="29"/>
+      <w:bookmarkStart w:colFirst="0" w:colLast="0" w:name="_heading=h.1y810tw" w:id="30"/>
+      <w:bookmarkEnd w:id="30"/>
       <w:r>
         <w:rPr>
           <w:rFonts w:ascii="Times New Roman" w:cs="Times New Roman" w:eastAsia="Times New Roman" w:hAnsi="Times New Roman"/>
@@ -19942,8 +20671,8 @@
           <w:rFonts w:ascii="Times New Roman" w:cs="Times New Roman" w:eastAsia="Times New Roman" w:hAnsi="Times New Roman"/>
         </w:rPr>
       </w:pPr>
-      <w:bookmarkStart w:colFirst="0" w:colLast="0" w:name="_heading=h.4i7ojhp" w:id="30"/>
-      <w:bookmarkEnd w:id="30"/>
+      <w:bookmarkStart w:colFirst="0" w:colLast="0" w:name="_heading=h.4i7ojhp" w:id="31"/>
+      <w:bookmarkEnd w:id="31"/>
       <w:r>
         <w:rPr>
           <w:rFonts w:ascii="Times New Roman" w:cs="Times New Roman" w:eastAsia="Times New Roman" w:hAnsi="Times New Roman"/>
@@ -20096,8 +20825,8 @@
           <w:rFonts w:ascii="Times New Roman" w:cs="Times New Roman" w:eastAsia="Times New Roman" w:hAnsi="Times New Roman"/>
         </w:rPr>
       </w:pPr>
-      <w:bookmarkStart w:colFirst="0" w:colLast="0" w:name="_heading=h.gikkqnwg4ke7" w:id="31"/>
-      <w:bookmarkEnd w:id="31"/>
+      <w:bookmarkStart w:colFirst="0" w:colLast="0" w:name="_heading=h.gikkqnwg4ke7" w:id="32"/>
+      <w:bookmarkEnd w:id="32"/>
       <w:r>
         <w:rPr>
           <w:rFonts w:ascii="Times New Roman" w:cs="Times New Roman" w:eastAsia="Times New Roman" w:hAnsi="Times New Roman"/>
@@ -20132,8 +20861,8 @@
           <w:rFonts w:ascii="Times New Roman" w:cs="Times New Roman" w:eastAsia="Times New Roman" w:hAnsi="Times New Roman"/>
         </w:rPr>
       </w:pPr>
-      <w:bookmarkStart w:colFirst="0" w:colLast="0" w:name="_heading=h.qwcic64cqk5w" w:id="32"/>
-      <w:bookmarkEnd w:id="32"/>
+      <w:bookmarkStart w:colFirst="0" w:colLast="0" w:name="_heading=h.qwcic64cqk5w" w:id="33"/>
+      <w:bookmarkEnd w:id="33"/>
       <w:r>
         <w:rPr>
           <w:rFonts w:ascii="Times New Roman" w:cs="Times New Roman" w:eastAsia="Times New Roman" w:hAnsi="Times New Roman"/>
@@ -20906,8 +21635,8 @@
           <w:rFonts w:ascii="Times New Roman" w:cs="Times New Roman" w:eastAsia="Times New Roman" w:hAnsi="Times New Roman"/>
         </w:rPr>
       </w:pPr>
-      <w:bookmarkStart w:colFirst="0" w:colLast="0" w:name="_heading=h.km2zsbtigny6" w:id="33"/>
-      <w:bookmarkEnd w:id="33"/>
+      <w:bookmarkStart w:colFirst="0" w:colLast="0" w:name="_heading=h.km2zsbtigny6" w:id="34"/>
+      <w:bookmarkEnd w:id="34"/>
       <w:r>
         <w:rPr>
           <w:rFonts w:ascii="Times New Roman" w:cs="Times New Roman" w:eastAsia="Times New Roman" w:hAnsi="Times New Roman"/>
@@ -22172,8 +22901,8 @@
           <w:rFonts w:ascii="Times New Roman" w:cs="Times New Roman" w:eastAsia="Times New Roman" w:hAnsi="Times New Roman"/>
         </w:rPr>
       </w:pPr>
-      <w:bookmarkStart w:colFirst="0" w:colLast="0" w:name="_heading=h.7pzp41s2tre8" w:id="34"/>
-      <w:bookmarkEnd w:id="34"/>
+      <w:bookmarkStart w:colFirst="0" w:colLast="0" w:name="_heading=h.7pzp41s2tre8" w:id="35"/>
+      <w:bookmarkEnd w:id="35"/>
       <w:r>
         <w:rPr>
           <w:rFonts w:ascii="Times New Roman" w:cs="Times New Roman" w:eastAsia="Times New Roman" w:hAnsi="Times New Roman"/>
@@ -22183,12 +22912,12 @@
       </w:r>
     </w:p>
     <w:sectPr>
-      <w:headerReference r:id="rId13" w:type="default"/>
-      <w:headerReference r:id="rId14" w:type="first"/>
-      <w:headerReference r:id="rId15" w:type="even"/>
-      <w:footerReference r:id="rId16" w:type="default"/>
-      <w:footerReference r:id="rId17" w:type="first"/>
-      <w:footerReference r:id="rId18" w:type="even"/>
+      <w:headerReference r:id="rId18" w:type="default"/>
+      <w:headerReference r:id="rId19" w:type="first"/>
+      <w:headerReference r:id="rId20" w:type="even"/>
+      <w:footerReference r:id="rId21" w:type="default"/>
+      <w:footerReference r:id="rId22" w:type="first"/>
+      <w:footerReference r:id="rId23" w:type="even"/>
       <w:pgSz w:h="16838" w:w="11906" w:orient="portrait"/>
       <w:pgMar w:bottom="1440" w:top="1440" w:left="1440" w:right="1416" w:header="708" w:footer="708"/>
       <w:pgNumType w:start="1"/>
@@ -25120,7 +25849,7 @@
 
 <file path=customXML/item1.xml><?xml version="1.0" encoding="utf-8"?>
 <go:gDocsCustomXmlDataStorage xmlns:go="http://customooxmlschemas.google.com/" xmlns:r="http://schemas.openxmlformats.org/officeDocument/2006/relationships" uri="GoogleDocsCustomDataVersion2">
-  <go:docsCustomData xmlns:go="http://customooxmlschemas.google.com/" roundtripDataSignature="AMtx7mjuxk7HNRB03N3puFRkdZlpuIPhbw==">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</go:docsCustomData>
+  <go:docsCustomData xmlns:go="http://customooxmlschemas.google.com/" roundtripDataSignature="AMtx7mjMNd+rFWr818uTq/O76TOVN18KfA==">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</go:docsCustomData>
 </go:gDocsCustomXmlDataStorage>
 </file>
 

</xml_diff>